<commit_message>
Add GitHub repository link to submission files
</commit_message>
<xml_diff>
--- a/report/submission_report.docx
+++ b/report/submission_report.docx
@@ -396,9 +396,15 @@
             </w:tcBorders>
           </w:tcPr>
           <w:p>
-            <w:r>
-              <w:t>REPLACE WITH YOUR GITHUB REPOSITORY URL</w:t>
-            </w:r>
+            <w:hyperlink r:id="rId10">
+              <w:r>
+                <w:rPr>
+                  <w:color w:val="315BBF"/>
+                  <w:u w:val="single"/>
+                </w:rPr>
+                <w:t>https://github.com/Manjureddy2003/ml-assignment-2</w:t>
+              </w:r>
+            </w:hyperlink>
           </w:p>
         </w:tc>
       </w:tr>
@@ -1361,7 +1367,7 @@
         </w:rPr>
         <w:t xml:space="preserve">Dataset source: </w:t>
       </w:r>
-      <w:hyperlink r:id="rId10">
+      <w:hyperlink r:id="rId11">
         <w:r>
           <w:rPr>
             <w:color w:val="315BBF"/>
@@ -3507,7 +3513,7 @@
                     <pic:cNvPicPr/>
                   </pic:nvPicPr>
                   <pic:blipFill>
-                    <a:blip r:embed="rId11"/>
+                    <a:blip r:embed="rId12"/>
                     <a:stretch>
                       <a:fillRect/>
                     </a:stretch>
@@ -3563,7 +3569,7 @@
                     <pic:cNvPicPr/>
                   </pic:nvPicPr>
                   <pic:blipFill>
-                    <a:blip r:embed="rId12"/>
+                    <a:blip r:embed="rId13"/>
                     <a:stretch>
                       <a:fillRect/>
                     </a:stretch>

</xml_diff>